<commit_message>
Update CV files with planning-focused version
</commit_message>
<xml_diff>
--- a/cv/RezaGhorbaniSaber_CV.docx
+++ b/cv/RezaGhorbaniSaber_CV.docx
@@ -30,7 +30,6 @@
           <w:lang w:val="nl-BE"/>
         </w:rPr>
       </w:pPr>
-      <w:proofErr w:type="spellStart"/>
       <w:r>
         <w:rPr>
           <w:rFonts w:ascii="Garamond" w:eastAsia="Garamond" w:hAnsi="Garamond" w:cs="Garamond"/>
@@ -38,17 +37,7 @@
           <w:szCs w:val="20"/>
           <w:lang w:val="nl-BE"/>
         </w:rPr>
-        <w:t>Ghent</w:t>
-      </w:r>
-      <w:proofErr w:type="spellEnd"/>
-      <w:r>
-        <w:rPr>
-          <w:rFonts w:ascii="Garamond" w:eastAsia="Garamond" w:hAnsi="Garamond" w:cs="Garamond"/>
-          <w:sz w:val="20"/>
-          <w:szCs w:val="20"/>
-          <w:lang w:val="nl-BE"/>
-        </w:rPr>
-        <w:t xml:space="preserve">, Belgium 9000| (+32) 466238086 | </w:t>
+        <w:t xml:space="preserve">Ghent, Belgium 9000 | (+32) 466238086 | </w:t>
       </w:r>
       <w:r>
         <w:rPr>
@@ -67,7 +56,28 @@
           <w:szCs w:val="20"/>
           <w:lang w:val="nl-BE"/>
         </w:rPr>
-        <w:t xml:space="preserve">| </w:t>
+        <w:t xml:space="preserve"> | </w:t>
+      </w:r>
+      <w:hyperlink r:id="rId5" w:history="1">
+        <w:r>
+          <w:rPr>
+            <w:rFonts w:ascii="Garamond" w:eastAsia="Garamond" w:hAnsi="Garamond" w:cs="Garamond"/>
+            <w:color w:val="002060"/>
+            <w:sz w:val="20"/>
+            <w:szCs w:val="20"/>
+            <w:lang w:val="nl-BE"/>
+          </w:rPr>
+          <w:t>Online CV</w:t>
+        </w:r>
+      </w:hyperlink>
+      <w:r>
+        <w:rPr>
+          <w:rFonts w:ascii="Garamond" w:eastAsia="Garamond" w:hAnsi="Garamond" w:cs="Garamond"/>
+          <w:sz w:val="20"/>
+          <w:szCs w:val="20"/>
+          <w:lang w:val="nl-BE"/>
+        </w:rPr>
+        <w:t xml:space="preserve"> | </w:t>
       </w:r>
       <w:bookmarkStart w:id="0" w:name="soqkb3703sdt" w:colFirst="0" w:colLast="0"/>
       <w:bookmarkStart w:id="1" w:name="y1brtf833kg3" w:colFirst="0" w:colLast="0"/>
@@ -104,39 +114,17 @@
         </w:rPr>
         <w:t xml:space="preserve"> | </w:t>
       </w:r>
-      <w:hyperlink r:id="rId5" w:history="1">
+      <w:hyperlink r:id="rId6" w:history="1">
         <w:r>
           <w:rPr>
             <w:rFonts w:ascii="Garamond" w:hAnsi="Garamond"/>
             <w:color w:val="002060"/>
-            <w:sz w:val="18"/>
-            <w:szCs w:val="18"/>
+            <w:sz w:val="20"/>
+            <w:szCs w:val="20"/>
             <w:lang w:val="nl-BE"/>
           </w:rPr>
-          <w:t xml:space="preserve">Google </w:t>
+          <w:t>Google Scholar</w:t>
         </w:r>
-        <w:proofErr w:type="spellStart"/>
-        <w:r>
-          <w:rPr>
-            <w:rFonts w:ascii="Garamond" w:hAnsi="Garamond"/>
-            <w:color w:val="002060"/>
-            <w:sz w:val="18"/>
-            <w:szCs w:val="18"/>
-            <w:lang w:val="nl-BE"/>
-          </w:rPr>
-          <w:t>S</w:t>
-        </w:r>
-        <w:r>
-          <w:rPr>
-            <w:rFonts w:ascii="Garamond" w:hAnsi="Garamond"/>
-            <w:color w:val="002060"/>
-            <w:sz w:val="18"/>
-            <w:szCs w:val="18"/>
-            <w:lang w:val="nl-BE"/>
-          </w:rPr>
-          <w:t>cholar</w:t>
-        </w:r>
-        <w:proofErr w:type="spellEnd"/>
       </w:hyperlink>
     </w:p>
     <w:p>
@@ -223,10 +211,6 @@
                 <w:szCs w:val="20"/>
               </w:rPr>
             </w:pPr>
-            <w:bookmarkStart w:id="2" w:name="ucb6dl92wm5t" w:colFirst="0" w:colLast="0"/>
-            <w:bookmarkStart w:id="3" w:name="z1r9aa2oncfw" w:colFirst="0" w:colLast="0"/>
-            <w:bookmarkEnd w:id="2"/>
-            <w:bookmarkEnd w:id="3"/>
             <w:r>
               <w:rPr>
                 <w:rFonts w:ascii="Garamond" w:hAnsi="Garamond"/>
@@ -236,7 +220,7 @@
                 <w:sz w:val="20"/>
                 <w:szCs w:val="20"/>
               </w:rPr>
-              <w:t>Operations Research specialist with expertise in combinatorial optimization, scheduling, exact/decomposition algorithms, metaheuristics, and stochastic optimization.</w:t>
+              <w:t>Operations Research specialist in production planning and scheduling: combinatorial, decomposition, and stochastic optimization.</w:t>
             </w:r>
           </w:p>
           <w:p>
@@ -269,7 +253,7 @@
                 <w:sz w:val="20"/>
                 <w:szCs w:val="20"/>
               </w:rPr>
-              <w:t>C/C++ developer experienced in implementing optimization algorithms, custom data structures, solver integrations, and computationally intensive scheduling applications.</w:t>
+              <w:t>Translates industrial planning problems into decision-support tools, from analysis and design to implementation and validation.</w:t>
             </w:r>
           </w:p>
           <w:p>
@@ -305,7 +289,7 @@
                 <w:sz w:val="20"/>
                 <w:szCs w:val="20"/>
               </w:rPr>
-              <w:t>Experienced in translating industrial planning and scheduling problems into mathematical and algorithmic solutions.</w:t>
+              <w:t>Industrial production planning experience, working with shop-floor teams, contractors, and executive management.</w:t>
             </w:r>
           </w:p>
           <w:p>
@@ -341,66 +325,7 @@
                 <w:sz w:val="20"/>
                 <w:szCs w:val="20"/>
               </w:rPr>
-              <w:t>E</w:t>
-            </w:r>
-            <w:r>
-              <w:rPr>
-                <w:rFonts w:ascii="Garamond" w:hAnsi="Garamond"/>
-                <w:b w:val="0"/>
-                <w:bCs w:val="0"/>
-                <w:color w:val="000000"/>
-                <w:sz w:val="20"/>
-                <w:szCs w:val="20"/>
-              </w:rPr>
-              <w:t xml:space="preserve">xperienced with </w:t>
-            </w:r>
-            <w:proofErr w:type="spellStart"/>
-            <w:r>
-              <w:rPr>
-                <w:rFonts w:ascii="Garamond" w:hAnsi="Garamond"/>
-                <w:b w:val="0"/>
-                <w:bCs w:val="0"/>
-                <w:color w:val="000000"/>
-                <w:sz w:val="20"/>
-                <w:szCs w:val="20"/>
-              </w:rPr>
-              <w:t>Gurobi</w:t>
-            </w:r>
-            <w:proofErr w:type="spellEnd"/>
-            <w:r>
-              <w:rPr>
-                <w:rFonts w:ascii="Garamond" w:hAnsi="Garamond"/>
-                <w:b w:val="0"/>
-                <w:bCs w:val="0"/>
-                <w:color w:val="000000"/>
-                <w:sz w:val="20"/>
-                <w:szCs w:val="20"/>
-              </w:rPr>
-              <w:t xml:space="preserve">, IBM ILOG CPLEX, CP Optimizer, Python, Git, </w:t>
-            </w:r>
-            <w:proofErr w:type="spellStart"/>
-            <w:r>
-              <w:rPr>
-                <w:rFonts w:ascii="Garamond" w:hAnsi="Garamond"/>
-                <w:b w:val="0"/>
-                <w:bCs w:val="0"/>
-                <w:color w:val="000000"/>
-                <w:sz w:val="20"/>
-                <w:szCs w:val="20"/>
-              </w:rPr>
-              <w:t>CMake</w:t>
-            </w:r>
-            <w:proofErr w:type="spellEnd"/>
-            <w:r>
-              <w:rPr>
-                <w:rFonts w:ascii="Garamond" w:hAnsi="Garamond"/>
-                <w:b w:val="0"/>
-                <w:bCs w:val="0"/>
-                <w:color w:val="000000"/>
-                <w:sz w:val="20"/>
-                <w:szCs w:val="20"/>
-              </w:rPr>
-              <w:t>, HPC, and Docker.</w:t>
+              <w:t>Programming in Python and C/C++; Gurobi, IBM ILOG CPLEX, CP Optimizer, Git, CMake, Docker, and HPC.</w:t>
             </w:r>
           </w:p>
         </w:tc>
@@ -511,23 +436,7 @@
                 <w:sz w:val="20"/>
                 <w:szCs w:val="20"/>
               </w:rPr>
-              <w:t>Ghent University</w:t>
-            </w:r>
-            <w:r>
-              <w:rPr>
-                <w:rFonts w:ascii="Garamond" w:eastAsia="Garamond" w:hAnsi="Garamond" w:cs="Garamond"/>
-                <w:sz w:val="20"/>
-                <w:szCs w:val="20"/>
-              </w:rPr>
-              <w:t xml:space="preserve"> &amp; Flanders Make</w:t>
-            </w:r>
-            <w:r>
-              <w:rPr>
-                <w:rFonts w:ascii="Garamond" w:eastAsia="Garamond" w:hAnsi="Garamond" w:cs="Garamond"/>
-                <w:sz w:val="20"/>
-                <w:szCs w:val="20"/>
-              </w:rPr>
-              <w:t>, Ghent, Belgium</w:t>
+              <w:t>Ghent University &amp; Flanders Make, Ghent, Belgium</w:t>
             </w:r>
           </w:p>
           <w:p>
@@ -554,47 +463,7 @@
                 <w:sz w:val="20"/>
                 <w:szCs w:val="20"/>
               </w:rPr>
-              <w:t>PhD Researcher</w:t>
-            </w:r>
-            <w:r>
-              <w:rPr>
-                <w:rFonts w:ascii="Garamond" w:eastAsia="Garamond" w:hAnsi="Garamond" w:cs="Garamond"/>
-                <w:b w:val="0"/>
-                <w:bCs w:val="0"/>
-                <w:sz w:val="20"/>
-                <w:szCs w:val="20"/>
-              </w:rPr>
-              <w:t xml:space="preserve"> &amp;</w:t>
-            </w:r>
-            <w:r>
-              <w:rPr>
-                <w:rFonts w:ascii="Garamond" w:eastAsia="Garamond" w:hAnsi="Garamond" w:cs="Garamond"/>
-                <w:b w:val="0"/>
-                <w:bCs w:val="0"/>
-                <w:sz w:val="20"/>
-                <w:szCs w:val="20"/>
-              </w:rPr>
-              <w:t xml:space="preserve"> Algorithm D</w:t>
-            </w:r>
-            <w:r>
-              <w:rPr>
-                <w:rFonts w:ascii="Garamond" w:eastAsia="Garamond" w:hAnsi="Garamond" w:cs="Garamond"/>
-                <w:b w:val="0"/>
-                <w:bCs w:val="0"/>
-                <w:sz w:val="20"/>
-                <w:szCs w:val="20"/>
-              </w:rPr>
-              <w:t>e</w:t>
-            </w:r>
-            <w:r>
-              <w:rPr>
-                <w:rFonts w:ascii="Garamond" w:eastAsia="Garamond" w:hAnsi="Garamond" w:cs="Garamond"/>
-                <w:b w:val="0"/>
-                <w:bCs w:val="0"/>
-                <w:sz w:val="20"/>
-                <w:szCs w:val="20"/>
-              </w:rPr>
-              <w:t>veloper</w:t>
+              <w:t>PhD Researcher &amp; Algorithm Developer</w:t>
             </w:r>
           </w:p>
           <w:p>
@@ -629,29 +498,7 @@
                 <w:sz w:val="20"/>
                 <w:szCs w:val="20"/>
               </w:rPr>
-              <w:t>Architected and implemented high-performance C++ scheduling engines for human-centric Flexible Job Shop Scheduling (FJSP</w:t>
-            </w:r>
-            <w:r>
-              <w:rPr>
-                <w:rFonts w:ascii="Garamond" w:hAnsi="Garamond"/>
-                <w:b w:val="0"/>
-                <w:bCs w:val="0"/>
-                <w:color w:val="000000"/>
-                <w:sz w:val="20"/>
-                <w:szCs w:val="20"/>
-              </w:rPr>
-              <w:t>)</w:t>
-            </w:r>
-            <w:r>
-              <w:rPr>
-                <w:rFonts w:ascii="Garamond" w:hAnsi="Garamond"/>
-                <w:b w:val="0"/>
-                <w:bCs w:val="0"/>
-                <w:color w:val="000000"/>
-                <w:sz w:val="20"/>
-                <w:szCs w:val="20"/>
-              </w:rPr>
-              <w:t>.</w:t>
+              <w:t>Designed and implemented C++ and Python scheduling engines for flexible job shops with machines, operator skills, and shift rules.</w:t>
             </w:r>
           </w:p>
           <w:p>
@@ -686,18 +533,7 @@
                 <w:sz w:val="20"/>
                 <w:szCs w:val="20"/>
               </w:rPr>
-              <w:t>Formulated both deterministic and stochastic optimization models to address real-world operational uncertainties, workforce side constraints, and dual-resource machine/operator allocation</w:t>
-            </w:r>
-            <w:r>
-              <w:rPr>
-                <w:rFonts w:ascii="Garamond" w:hAnsi="Garamond"/>
-                <w:b w:val="0"/>
-                <w:bCs w:val="0"/>
-                <w:color w:val="000000"/>
-                <w:sz w:val="20"/>
-                <w:szCs w:val="20"/>
-              </w:rPr>
-              <w:t>.</w:t>
+              <w:t>Formulated deterministic and stochastic optimization models addressing operational uncertainty, workforce side constraints, and dual-resource machine/operator allocation.</w:t>
             </w:r>
           </w:p>
           <w:p>
@@ -732,73 +568,7 @@
                 <w:sz w:val="20"/>
                 <w:szCs w:val="20"/>
               </w:rPr>
-              <w:t xml:space="preserve"> </w:t>
-            </w:r>
-            <w:r>
-              <w:rPr>
-                <w:rFonts w:ascii="Garamond" w:hAnsi="Garamond"/>
-                <w:b w:val="0"/>
-                <w:bCs w:val="0"/>
-                <w:color w:val="000000"/>
-                <w:sz w:val="20"/>
-                <w:szCs w:val="20"/>
-              </w:rPr>
-              <w:t>Implemented</w:t>
-            </w:r>
-            <w:r>
-              <w:rPr>
-                <w:rFonts w:ascii="Garamond" w:hAnsi="Garamond"/>
-                <w:b w:val="0"/>
-                <w:bCs w:val="0"/>
-                <w:color w:val="000000"/>
-                <w:sz w:val="20"/>
-                <w:szCs w:val="20"/>
-              </w:rPr>
-              <w:t xml:space="preserve"> exact decomposition schemes (Logic-Based Benders Decomposition, MIP, CP)</w:t>
-            </w:r>
-            <w:r>
-              <w:rPr>
-                <w:rFonts w:ascii="Garamond" w:hAnsi="Garamond"/>
-                <w:b w:val="0"/>
-                <w:bCs w:val="0"/>
-                <w:color w:val="000000"/>
-                <w:sz w:val="20"/>
-                <w:szCs w:val="20"/>
-              </w:rPr>
-              <w:t xml:space="preserve"> and </w:t>
-            </w:r>
-            <w:r>
-              <w:rPr>
-                <w:rFonts w:ascii="Garamond" w:hAnsi="Garamond"/>
-                <w:b w:val="0"/>
-                <w:bCs w:val="0"/>
-                <w:color w:val="000000"/>
-                <w:sz w:val="20"/>
-                <w:szCs w:val="20"/>
-              </w:rPr>
-              <w:t xml:space="preserve">local search metaheuristics to </w:t>
-            </w:r>
-            <w:r>
-              <w:rPr>
-                <w:rFonts w:ascii="Garamond" w:hAnsi="Garamond"/>
-                <w:b w:val="0"/>
-                <w:bCs w:val="0"/>
-                <w:color w:val="000000"/>
-                <w:sz w:val="20"/>
-                <w:szCs w:val="20"/>
-              </w:rPr>
-              <w:t xml:space="preserve">improve solution quality and </w:t>
-            </w:r>
-            <w:r>
-              <w:rPr>
-                <w:rFonts w:ascii="Garamond" w:hAnsi="Garamond"/>
-                <w:b w:val="0"/>
-                <w:bCs w:val="0"/>
-                <w:color w:val="000000"/>
-                <w:sz w:val="20"/>
-                <w:szCs w:val="20"/>
-              </w:rPr>
-              <w:t xml:space="preserve"> cut runtime on large-scale benchmarks.</w:t>
+              <w:t>Implemented Logic-Based Benders Decomposition (MIP, CP) and tabu search; cut the average optimality gap from 37% to 6% on 262 instances.</w:t>
             </w:r>
           </w:p>
           <w:p>
@@ -833,40 +603,7 @@
                 <w:sz w:val="20"/>
                 <w:szCs w:val="20"/>
               </w:rPr>
-              <w:t xml:space="preserve">Developed and </w:t>
-            </w:r>
-            <w:r>
-              <w:rPr>
-                <w:rFonts w:ascii="Garamond" w:eastAsia="Garamond" w:hAnsi="Garamond" w:cs="Garamond"/>
-                <w:b w:val="0"/>
-                <w:bCs w:val="0"/>
-                <w:color w:val="000000"/>
-                <w:sz w:val="20"/>
-                <w:szCs w:val="20"/>
-              </w:rPr>
-              <w:t>i</w:t>
-            </w:r>
-            <w:r>
-              <w:rPr>
-                <w:rFonts w:ascii="Garamond" w:eastAsia="Garamond" w:hAnsi="Garamond" w:cs="Garamond"/>
-                <w:b w:val="0"/>
-                <w:bCs w:val="0"/>
-                <w:color w:val="000000"/>
-                <w:sz w:val="20"/>
-                <w:szCs w:val="20"/>
-              </w:rPr>
-              <w:t>mplemented</w:t>
-            </w:r>
-            <w:r>
-              <w:rPr>
-                <w:rFonts w:ascii="Garamond" w:eastAsia="Garamond" w:hAnsi="Garamond" w:cs="Garamond"/>
-                <w:b w:val="0"/>
-                <w:bCs w:val="0"/>
-                <w:color w:val="000000"/>
-                <w:sz w:val="20"/>
-                <w:szCs w:val="20"/>
-              </w:rPr>
-              <w:t xml:space="preserve"> algorithmic development within the collaborative industry project S4FMS, building modular C++ and Python APIs to integrate optimization engines into partner architectures and industrial testbeds.</w:t>
+              <w:t>Collaborated with industrial partners in the S4FMS project, building APIs to integrate optimization engines into partner architectures and industrial testbeds, where the operator-timetabling scheduler is being tested.</w:t>
             </w:r>
           </w:p>
           <w:p>
@@ -901,31 +638,7 @@
                 <w:sz w:val="20"/>
                 <w:szCs w:val="20"/>
               </w:rPr>
-              <w:t>Interfaced production-grade mathematical solvers (</w:t>
-            </w:r>
-            <w:proofErr w:type="spellStart"/>
-            <w:r>
-              <w:rPr>
-                <w:rFonts w:ascii="Garamond" w:hAnsi="Garamond"/>
-                <w:b w:val="0"/>
-                <w:bCs w:val="0"/>
-                <w:color w:val="000000"/>
-                <w:sz w:val="20"/>
-                <w:szCs w:val="20"/>
-              </w:rPr>
-              <w:t>Gurobi</w:t>
-            </w:r>
-            <w:proofErr w:type="spellEnd"/>
-            <w:r>
-              <w:rPr>
-                <w:rFonts w:ascii="Garamond" w:hAnsi="Garamond"/>
-                <w:b w:val="0"/>
-                <w:bCs w:val="0"/>
-                <w:color w:val="000000"/>
-                <w:sz w:val="20"/>
-                <w:szCs w:val="20"/>
-              </w:rPr>
-              <w:t>, IBM ILOG CPLEX, CP Optimizer) with custom C++ data structures and graph-based search routines.</w:t>
+              <w:t>Presented results at international conferences (EURO, ORBEL, INCOM, APMS) and published instances and results as open data.</w:t>
             </w:r>
           </w:p>
         </w:tc>
@@ -1044,18 +757,7 @@
                 <w:sz w:val="20"/>
                 <w:szCs w:val="20"/>
               </w:rPr>
-              <w:t xml:space="preserve">Directed production planning and resource scheduling across specialized manufacturing facilities (Machine, CNC, </w:t>
-            </w:r>
-            <w:r>
-              <w:rPr>
-                <w:rFonts w:ascii="Garamond" w:eastAsia="Garamond" w:hAnsi="Garamond" w:cs="Garamond"/>
-                <w:b w:val="0"/>
-                <w:bCs w:val="0"/>
-                <w:color w:val="000000"/>
-                <w:sz w:val="20"/>
-                <w:szCs w:val="20"/>
-              </w:rPr>
-              <w:t>Laser Cladding, and Assembly shops) for over 20 industrial R&amp;D projects</w:t>
+              <w:t>Directed production planning and resource scheduling across Machine, CNC, Laser Cladding, and Assembly shops for 20+ industrial R&amp;D projects.</w:t>
             </w:r>
           </w:p>
           <w:p>
@@ -1090,7 +792,7 @@
                 <w:sz w:val="20"/>
                 <w:szCs w:val="20"/>
               </w:rPr>
-              <w:t>Developed an automated database and reporting pipeline linking MS Access and Excel, delivering real-time shop-floor tracking, capacity visibility, and financial progress dashboards to executive management.</w:t>
+              <w:t>Built an automated MS Access/Excel database and reporting pipeline, delivering real-time shop-floor tracking, capacity visibility, and financial progress dashboards to executive management.</w:t>
             </w:r>
           </w:p>
           <w:p>
@@ -1122,7 +824,7 @@
                 <w:sz w:val="20"/>
                 <w:szCs w:val="20"/>
               </w:rPr>
-              <w:t>Mitigated operational bottlenecks and contractor schedules by translating physical machine constraints and job priorities into actionable production timetables</w:t>
+              <w:t>Relieved operational bottlenecks and contractor delays by translating machine constraints and job priorities into actionable production timetables.</w:t>
             </w:r>
           </w:p>
         </w:tc>
@@ -1530,29 +1232,7 @@
                 <w:sz w:val="20"/>
                 <w:szCs w:val="20"/>
               </w:rPr>
-              <w:t xml:space="preserve">., Leyman, P., &amp; </w:t>
-            </w:r>
-            <w:proofErr w:type="spellStart"/>
-            <w:r>
-              <w:rPr>
-                <w:rFonts w:ascii="Garamond" w:eastAsia="Garamond" w:hAnsi="Garamond" w:cs="Garamond"/>
-                <w:b w:val="0"/>
-                <w:bCs w:val="0"/>
-                <w:sz w:val="20"/>
-                <w:szCs w:val="20"/>
-              </w:rPr>
-              <w:t>Aghezzaf</w:t>
-            </w:r>
-            <w:proofErr w:type="spellEnd"/>
-            <w:r>
-              <w:rPr>
-                <w:rFonts w:ascii="Garamond" w:eastAsia="Garamond" w:hAnsi="Garamond" w:cs="Garamond"/>
-                <w:b w:val="0"/>
-                <w:bCs w:val="0"/>
-                <w:sz w:val="20"/>
-                <w:szCs w:val="20"/>
-              </w:rPr>
-              <w:t>, E. H. (2026). Decision support for the integrated flexible job shop scheduling and operator timetabling problem. </w:t>
+              <w:t>., Leyman, P., &amp; Aghezzaf, E. H. (2026). Decision support for the integrated flexible job shop scheduling and operator timetabling problem. </w:t>
             </w:r>
             <w:r>
               <w:rPr>
@@ -1574,19 +1254,9 @@
                 <w:sz w:val="20"/>
                 <w:szCs w:val="20"/>
               </w:rPr>
-              <w:t>, 1-28.</w:t>
-            </w:r>
-            <w:r>
-              <w:rPr>
-                <w:rFonts w:ascii="Garamond" w:eastAsia="Garamond" w:hAnsi="Garamond" w:cs="Garamond"/>
-                <w:b w:val="0"/>
-                <w:bCs w:val="0"/>
-                <w:sz w:val="20"/>
-                <w:szCs w:val="20"/>
-              </w:rPr>
-              <w:t xml:space="preserve"> </w:t>
-            </w:r>
-            <w:hyperlink r:id="rId6" w:history="1">
+              <w:t xml:space="preserve">, 1-28. </w:t>
+            </w:r>
+            <w:hyperlink r:id="rId7" w:history="1">
               <w:r>
                 <w:rPr>
                   <w:rStyle w:val="Hyperlink"/>
@@ -1641,7 +1311,7 @@
                 <w:sz w:val="20"/>
                 <w:szCs w:val="20"/>
               </w:rPr>
-              <w:t>., &amp; Ranjbar, M. (2022). Minimizing the total tardiness and the total carbon emissions in the permutation flow shop scheduling problem. </w:t>
+              <w:t>., Leyman, P., &amp; Aghezzaf, E. H. (under review). A Benders decomposition-based hybrid approach to the dual resource constrained flexible job shop scheduling problem. </w:t>
             </w:r>
             <w:r>
               <w:rPr>
@@ -1663,7 +1333,47 @@
                 <w:sz w:val="20"/>
                 <w:szCs w:val="20"/>
               </w:rPr>
-              <w:t>, </w:t>
+              <w:t>.</w:t>
+            </w:r>
+          </w:p>
+        </w:tc>
+      </w:tr>
+      <w:tr>
+        <w:tc>
+          <w:tcPr>
+            <w:cnfStyle w:val="001000000000" w:firstRow="0" w:lastRow="0" w:firstColumn="1" w:lastColumn="0" w:oddVBand="0" w:evenVBand="0" w:oddHBand="0" w:evenHBand="0" w:firstRowFirstColumn="0" w:firstRowLastColumn="0" w:lastRowFirstColumn="0" w:lastRowLastColumn="0"/>
+            <w:tcW w:w="10800" w:type="dxa"/>
+            <w:tcBorders>
+              <w:left w:val="nil"/>
+            </w:tcBorders>
+          </w:tcPr>
+          <w:p>
+            <w:pPr>
+              <w:spacing w:after="40"/>
+              <w:jc w:val="both"/>
+              <w:rPr>
+                <w:rFonts w:ascii="Garamond" w:eastAsia="Garamond" w:hAnsi="Garamond" w:cs="Garamond"/>
+                <w:sz w:val="20"/>
+                <w:szCs w:val="20"/>
+              </w:rPr>
+            </w:pPr>
+            <w:r>
+              <w:rPr>
+                <w:rFonts w:ascii="Garamond" w:eastAsia="Garamond" w:hAnsi="Garamond" w:cs="Garamond"/>
+                <w:sz w:val="20"/>
+                <w:szCs w:val="20"/>
+              </w:rPr>
+              <w:t>Ghorbani Saber, R</w:t>
+            </w:r>
+            <w:r>
+              <w:rPr>
+                <w:rFonts w:ascii="Garamond" w:eastAsia="Garamond" w:hAnsi="Garamond" w:cs="Garamond"/>
+                <w:b w:val="0"/>
+                <w:bCs w:val="0"/>
+                <w:sz w:val="20"/>
+                <w:szCs w:val="20"/>
+              </w:rPr>
+              <w:t>., &amp; Ranjbar, M. (2022). Minimizing the total tardiness and the total carbon emissions in the permutation flow shop scheduling problem. </w:t>
             </w:r>
             <w:r>
               <w:rPr>
@@ -1675,6 +1385,28 @@
                 <w:sz w:val="20"/>
                 <w:szCs w:val="20"/>
               </w:rPr>
+              <w:t>Computers &amp; Operations Research</w:t>
+            </w:r>
+            <w:r>
+              <w:rPr>
+                <w:rFonts w:ascii="Garamond" w:eastAsia="Garamond" w:hAnsi="Garamond" w:cs="Garamond"/>
+                <w:b w:val="0"/>
+                <w:bCs w:val="0"/>
+                <w:sz w:val="20"/>
+                <w:szCs w:val="20"/>
+              </w:rPr>
+              <w:t>, </w:t>
+            </w:r>
+            <w:r>
+              <w:rPr>
+                <w:rFonts w:ascii="Garamond" w:eastAsia="Garamond" w:hAnsi="Garamond" w:cs="Garamond"/>
+                <w:b w:val="0"/>
+                <w:bCs w:val="0"/>
+                <w:i/>
+                <w:iCs/>
+                <w:sz w:val="20"/>
+                <w:szCs w:val="20"/>
+              </w:rPr>
               <w:t>138</w:t>
             </w:r>
             <w:r>
@@ -1685,19 +1417,9 @@
                 <w:sz w:val="20"/>
                 <w:szCs w:val="20"/>
               </w:rPr>
-              <w:t>, 105604.</w:t>
-            </w:r>
-            <w:r>
-              <w:rPr>
-                <w:rFonts w:ascii="Garamond" w:eastAsia="Garamond" w:hAnsi="Garamond" w:cs="Garamond"/>
-                <w:b w:val="0"/>
-                <w:bCs w:val="0"/>
-                <w:sz w:val="20"/>
-                <w:szCs w:val="20"/>
-              </w:rPr>
-              <w:t xml:space="preserve"> </w:t>
-            </w:r>
-            <w:hyperlink r:id="rId7" w:history="1">
+              <w:t xml:space="preserve">, 105604. </w:t>
+            </w:r>
+            <w:hyperlink r:id="rId8" w:history="1">
               <w:r>
                 <w:rPr>
                   <w:rStyle w:val="Hyperlink"/>
@@ -1714,6 +1436,9 @@
         </w:tc>
       </w:tr>
       <w:tr>
+        <w:trPr>
+          <w:cnfStyle w:val="000000100000" w:firstRow="0" w:lastRow="0" w:firstColumn="0" w:lastColumn="0" w:oddVBand="0" w:evenVBand="0" w:oddHBand="1" w:evenHBand="0" w:firstRowFirstColumn="0" w:firstRowLastColumn="0" w:lastRowFirstColumn="0" w:lastRowLastColumn="0"/>
+        </w:trPr>
         <w:tc>
           <w:tcPr>
             <w:cnfStyle w:val="001000000000" w:firstRow="0" w:lastRow="0" w:firstColumn="1" w:lastColumn="0" w:oddVBand="0" w:evenVBand="0" w:oddHBand="0" w:evenHBand="0" w:firstRowFirstColumn="0" w:firstRowLastColumn="0" w:lastRowFirstColumn="0" w:lastRowLastColumn="0"/>
@@ -1802,19 +1527,9 @@
                 <w:sz w:val="20"/>
                 <w:szCs w:val="20"/>
               </w:rPr>
-              <w:t>, 106736.</w:t>
-            </w:r>
-            <w:r>
-              <w:rPr>
-                <w:rFonts w:ascii="Garamond" w:eastAsia="Garamond" w:hAnsi="Garamond" w:cs="Garamond"/>
-                <w:b w:val="0"/>
-                <w:bCs w:val="0"/>
-                <w:sz w:val="20"/>
-                <w:szCs w:val="20"/>
-              </w:rPr>
-              <w:t xml:space="preserve"> </w:t>
-            </w:r>
-            <w:hyperlink r:id="rId8" w:history="1">
+              <w:t xml:space="preserve">, 106736. </w:t>
+            </w:r>
+            <w:hyperlink r:id="rId9" w:history="1">
               <w:r>
                 <w:rPr>
                   <w:rStyle w:val="Hyperlink"/>
@@ -3475,6 +3190,7 @@
   <w:style w:type="character" w:default="1" w:styleId="DefaultParagraphFont">
     <w:name w:val="Default Paragraph Font"/>
     <w:uiPriority w:val="1"/>
+    <w:semiHidden/>
     <w:unhideWhenUsed/>
   </w:style>
   <w:style w:type="table" w:default="1" w:styleId="TableNormal">

</xml_diff>